<commit_message>
docs: revisar relatório parcial conforme o modelo da Univesp
- inclui capturas de tela da aplicação (Figuras 2 e 3) na seção 2.5
- fundamenta a prática com questões (efeito de testagem) e o limite de
  três minutos no edital do ENEM 2023
- cita BLUEX, Hugging Face e enem.dev e destaca títulos nas referências
- atualiza os números de testes da revisão 0179585
- adiciona versão em Markdown, figuras e capturas originais

Refs #58
</commit_message>
<xml_diff>
--- a/docs/entregas/Relatorio-Parcial-Maratona.docx
+++ b/docs/entregas/Relatorio-Parcial-Maratona.docx
@@ -10,6 +10,7 @@
       <w:r>
         <w:rPr>
           <w:rFonts w:ascii="Times New Roman" w:hAnsi="Times New Roman"/>
+          <w:b/>
           <w:sz w:val="28"/>
         </w:rPr>
         <w:t>UNIVERSIDADE VIRTUAL DO ESTADO DE SÃO PAULO</w:t>
@@ -86,6 +87,7 @@
       <w:r>
         <w:rPr>
           <w:rFonts w:ascii="Times New Roman" w:hAnsi="Times New Roman"/>
+          <w:b/>
           <w:sz w:val="28"/>
         </w:rPr>
         <w:t>UNIVERSIDADE VIRTUAL DO ESTADO DE SÃO PAULO</w:t>
@@ -155,7 +157,7 @@
         <w:rPr>
           <w:rFonts w:ascii="Times New Roman" w:hAnsi="Times New Roman"/>
         </w:rPr>
-        <w:t>SOUZA, Paulo Vitor de; SILVA, Erikson Souza da; BASTOS NETO, Elias Alves. Maratona como plataforma offline de questões para treino da gestão do tempo. 15 f. Relatório Técnico-Científico Parcial. Projeto Integrador em Computação II (PJI240) - Universidade Virtual do Estado de São Paulo. Orientador: Augusto Rafael Carvalho De Sousa. Polo Campinas, 2026.</w:t>
+        <w:t>SOUZA, Paulo Vitor de; SILVA, Erikson Souza da; BASTOS NETO, Elias Alves. Maratona como plataforma offline de questões para treino da gestão do tempo. 20 f. Relatório Técnico-Científico Parcial. Projeto Integrador em Computação II (PJI240) - Universidade Virtual do Estado de São Paulo. Orientador: Augusto Rafael Carvalho De Sousa. Polo Campinas, 2026.</w:t>
       </w:r>
     </w:p>
     <w:p>
@@ -189,8 +191,15 @@
       <w:r>
         <w:rPr>
           <w:rFonts w:ascii="Times New Roman" w:hAnsi="Times New Roman"/>
-        </w:rPr>
-        <w:t>PALAVRAS-CHAVE: Gestão do tempo; Vestibulares; Aplicação web progressiva; Estudo offline; Tecnologia educacional.</w:t>
+          <w:b/>
+        </w:rPr>
+        <w:t xml:space="preserve">PALAVRAS-CHAVE:</w:t>
+      </w:r>
+      <w:r>
+        <w:rPr>
+          <w:rFonts w:ascii="Times New Roman" w:hAnsi="Times New Roman"/>
+        </w:rPr>
+        <w:t xml:space="preserve"> Gestão do tempo; Vestibulares; Aplicação web progressiva; Estudo offline; Tecnologia educacional.</w:t>
       </w:r>
     </w:p>
     <w:p>
@@ -319,7 +328,7 @@
         </w:rPr>
         <w:t>2.4 Metodologia</w:t>
         <w:tab/>
-        <w:t>6</w:t>
+        <w:t>7</w:t>
       </w:r>
     </w:p>
     <w:p>
@@ -335,9 +344,9 @@
           <w:rFonts w:ascii="Times New Roman" w:hAnsi="Times New Roman"/>
           <w:b w:val="0"/>
         </w:rPr>
-        <w:t>2.5 Resultados preliminares e solução inicial</w:t>
+        <w:t>2.5 Resultados preliminares: solução inicial</w:t>
         <w:tab/>
-        <w:t>8</w:t>
+        <w:t>9</w:t>
       </w:r>
     </w:p>
     <w:p>
@@ -355,7 +364,7 @@
         </w:rPr>
         <w:t>REFERÊNCIAS</w:t>
         <w:tab/>
-        <w:t>11</w:t>
+        <w:t>15</w:t>
       </w:r>
     </w:p>
     <w:p>
@@ -630,7 +639,7 @@
         <w:rPr>
           <w:rFonts w:ascii="Times New Roman" w:hAnsi="Times New Roman"/>
         </w:rPr>
-        <w:t>A justificativa prática decorre de uma necessidade observada no convívio do grupo: acertar questões isoladas não garante que o estudante consiga administrar o tempo de uma prova extensa. Uma ferramenta que registre o tempo de resposta e mostre o desempenho pode fornecer informações para que ele reconheça dificuldades e ajuste sua rotina de treino. O limite de três minutos adotado na versão inicial é uma configuração do produto, e não uma regra oficial comum a todas as bancas.</w:t>
+        <w:t xml:space="preserve">A justificativa prática decorre de uma necessidade observada no convívio do grupo: acertar questões isoladas não garante que o estudante consiga administrar o tempo de uma prova extensa. Uma ferramenta que registre o tempo de resposta e mostre o desempenho pode fornecer informações para que ele reconheça dificuldades e ajuste sua rotina de treino. O limite de três minutos adotado na versão inicial é uma configuração do produto, derivada do tempo médio disponível por questão no ENEM (seção 2.3), e não uma regra oficial comum a todas as bancas.</w:t>
       </w:r>
     </w:p>
     <w:p>
@@ -697,7 +706,18 @@
         <w:rPr>
           <w:rFonts w:ascii="Times New Roman" w:hAnsi="Times New Roman"/>
         </w:rPr>
-        <w:t>A proposta associa o treino à observação do desempenho. Os indicadores de acerto e tempo oferecem informações para a reflexão do estudante, mas não comprovam aprendizagem ou preparação para uma prova.</w:t>
+        <w:t xml:space="preserve">A proposta associa o treino à prática com questões e à observação do desempenho. Estudos de psicologia cognitiva indicam que responder questões, em vez de apenas reler o conteúdo, favorece a retenção de longo prazo, fenômeno conhecido como efeito de testagem (ROEDIGER; KARPICKE, 2006). Em uma revisão de dez técnicas de estudo, Dunlosky et al. (2013) classificaram a prática com testes entre as de maior utilidade, com resultados consistentes para diferentes idades, conteúdos e formatos de avaliação. Esses resultados sustentam a escolha de um feed de questões como atividade central da Maratona. Os indicadores de acerto e tempo, por sua vez, oferecem informações para a reflexão do estudante, mas não comprovam aprendizagem ou preparação para uma prova.</w:t>
+      </w:r>
+    </w:p>
+    <w:p>
+      <w:pPr>
+        <w:spacing w:before="0" w:after="240" w:line="360" w:lineRule="auto"/>
+      </w:pPr>
+      <w:r>
+        <w:rPr>
+          <w:rFonts w:ascii="Times New Roman" w:hAnsi="Times New Roman"/>
+        </w:rPr>
+        <w:t xml:space="preserve">No ENEM, cada dia de aplicação reúne 90 questões objetivas. No segundo dia, dedicado a Ciências da Natureza e Matemática, a duração é de 5 horas, o que corresponde a cerca de 3 minutos e 20 segundos por questão; no primeiro dia, as 5 horas e 30 minutos incluem também a redação (INEP, 2023). O limite de três minutos adotado na Maratona aproxima-se dessa média e reserva uma margem para revisão e preenchimento do cartão-resposta. Trata-se de uma referência de treino: na prova, as questões variam em extensão e dificuldade, e o estudante distribui o tempo livremente.</w:t>
       </w:r>
     </w:p>
     <w:p>
@@ -719,7 +739,7 @@
         <w:rPr>
           <w:rFonts w:ascii="Times New Roman" w:hAnsi="Times New Roman"/>
         </w:rPr>
-        <w:t>Em uma PWA, service workers podem tratar requisições e utilizar cache para disponibilizar recursos previamente armazenados quando a rede está indisponível (MDN WEB DOCS, s.d.). Na Maratona, o Cache Storage conserva pacotes e imagens e o IndexedDB registra metadados, progresso, sessões e eventos pendentes. O estudo offline depende de download prévio e de espaço no dispositivo.</w:t>
+        <w:t xml:space="preserve">Em uma PWA, service workers podem tratar requisições e utilizar cache para disponibilizar recursos previamente armazenados quando a rede está indisponível (MDN WEB DOCS, s.d.). Na Maratona, o Cache Storage conserva pacotes e imagens e o IndexedDB registra metadados, progresso, sessões e eventos pendentes.</w:t>
       </w:r>
     </w:p>
     <w:p>
@@ -741,7 +761,7 @@
         <w:rPr>
           <w:rFonts w:ascii="Times New Roman" w:hAnsi="Times New Roman"/>
         </w:rPr>
-        <w:t>O Better Auth oferece autenticação e gerenciamento de contas e sessões para TypeScript (BETTER AUTH, s.d.). No projeto, está configurado para e-mail e senha e login com Google, com mensagens de verificação e recuperação por Resend. A validação desses serviços em produção depende de credenciais e infraestrutura próprias.</w:t>
+        <w:t xml:space="preserve">O Better Auth oferece autenticação e gerenciamento de contas e sessões para TypeScript (BETTER AUTH, s.d.). No projeto, está configurado para e-mail e senha e login com Google, com mensagens de verificação e recuperação por Resend.</w:t>
       </w:r>
     </w:p>
     <w:p>
@@ -797,18 +817,18 @@
         <w:rPr>
           <w:rFonts w:ascii="Times New Roman" w:hAnsi="Times New Roman"/>
         </w:rPr>
-        <w:t>Na etapa de criar, o grupo discutiu o escopo pelo WhatsApp e adotou o feed de questões com limite de tempo e progresso local. Em 23 de agosto, foi comunicado o desenvolvimento de um MVP com React, armazenamento local e backend Cloudflare. Em 11 de setembro, foi registrada a inclusão de questões da Comvest e da Fuvest provenientes de um dataset do Hugging Face, além da organização de tarefas em épicos e marcos no GitHub.</w:t>
-      </w:r>
-    </w:p>
-    <w:p>
-      <w:pPr>
-        <w:spacing w:before="0" w:after="240" w:line="360" w:lineRule="auto"/>
-      </w:pPr>
-      <w:r>
-        <w:rPr>
-          <w:rFonts w:ascii="Times New Roman" w:hAnsi="Times New Roman"/>
-        </w:rPr>
-        <w:t>O tratamento dos dados utiliza importadores para a API pública do projeto enem.dev e para o dataset BLUEX. A API enem.dev é uma fonte de terceiros, e não uma API oficial do INEP. Os registros são normalizados para um contrato comum, com identificadores de banca, edição, matéria, alternativas e gabarito. São mantidos relatórios de importação, rejeições e lacunas; dados incompletos não são preenchidos por suposição. A integridade dos pacotes é conferida por tamanho e hash SHA-256.</w:t>
+        <w:t xml:space="preserve">Na etapa de criar, o grupo discutiu o escopo pelo WhatsApp e adotou o feed de questões com limite de tempo e progresso local. Em 23 de agosto, foi comunicado o desenvolvimento de um MVP com React, armazenamento local e backend Cloudflare. Em 11 de setembro, foi registrada a inclusão de questões da Comvest e da Fuvest provenientes do dataset BLUEX, disponibilizado no Hugging Face (PORTUGUESE BENCHMARK DATASETS, s.d.), além da organização de tarefas em épicos e marcos no GitHub.</w:t>
+      </w:r>
+    </w:p>
+    <w:p>
+      <w:pPr>
+        <w:spacing w:before="0" w:after="240" w:line="360" w:lineRule="auto"/>
+      </w:pPr>
+      <w:r>
+        <w:rPr>
+          <w:rFonts w:ascii="Times New Roman" w:hAnsi="Times New Roman"/>
+        </w:rPr>
+        <w:t xml:space="preserve">O tratamento dos dados utiliza importadores para a API pública do projeto enem.dev (ENEM.DEV, s.d.) e para o dataset BLUEX, que reúne questões de primeira fase da Unicamp e da USP (ALMEIDA et al., 2023). A API enem.dev é uma fonte de terceiros, e não uma API oficial do INEP. Os registros são normalizados para um contrato comum, com identificadores de banca, edição, matéria, alternativas e gabarito. São mantidos relatórios de importação, rejeições e lacunas; dados incompletos não são preenchidos por suposição. A integridade dos pacotes é conferida por tamanho e hash SHA-256.</w:t>
       </w:r>
     </w:p>
     <w:p>
@@ -865,7 +885,7 @@
         <w:rPr>
           <w:rFonts w:ascii="Times New Roman" w:hAnsi="Times New Roman"/>
         </w:rPr>
-        <w:t>2.5 Resultados preliminares e solução inicial</w:t>
+        <w:t>2.5 Resultados preliminares: solução inicial</w:t>
       </w:r>
     </w:p>
     <w:p>
@@ -887,7 +907,7 @@
         <w:rPr>
           <w:rFonts w:ascii="Times New Roman" w:hAnsi="Times New Roman"/>
         </w:rPr>
-        <w:t>A Figura 1 apresenta a organização da solução. As fontes alimentam os importadores; os pacotes validados são disponibilizados à aplicação; o dispositivo mantém o conteúdo e o progresso; e a sincronização com conta conecta os registros locais ao backend. A infraestrutura remota representada corresponde à arquitetura implementada, cuja operação em produção ainda requer validação.</w:t>
+        <w:t xml:space="preserve">A Figura 1 apresenta a organização da solução. As fontes alimentam os importadores; os pacotes validados são disponibilizados à aplicação; o dispositivo mantém o conteúdo e o progresso; e a sincronização com conta conecta os registros locais ao backend.</w:t>
       </w:r>
     </w:p>
     <w:p>
@@ -1659,18 +1679,163 @@
         <w:rPr>
           <w:rFonts w:ascii="Times New Roman" w:hAnsi="Times New Roman"/>
         </w:rPr>
-        <w:t>No fluxo de estudo, a aplicação permite selecionar uma edição, baixar o conteúdo e escolher o idioma estrangeiro quando aplicável. O feed apresenta o enunciado, as alternativas e o cronômetro. A resposta ou o término do tempo bloqueia as alternativas e apresenta feedback. Nas alterações de setembro, foram incorporadas a pausa do timer ao sair da questão visível e a possibilidade de riscar alternativas durante a leitura, preservando o rascunho local.</w:t>
-      </w:r>
-    </w:p>
-    <w:p>
-      <w:pPr>
-        <w:spacing w:before="0" w:after="240" w:line="360" w:lineRule="auto"/>
-      </w:pPr>
-      <w:r>
-        <w:rPr>
-          <w:rFonts w:ascii="Times New Roman" w:hAnsi="Times New Roman"/>
-        </w:rPr>
-        <w:t>As estatísticas incluem questões vistas e respondidas, taxa de acerto, esgotamentos de tempo, tempo médio e sequência de dias estudados, com agrupamentos por matéria e prova. Esses recursos já permitem apresentar informações da prática. A Tabela 2 distingue essa implementação de entregas que ainda exigem validação ou desenvolvimento.</w:t>
+        <w:t xml:space="preserve">No fluxo de estudo, a aplicação permite selecionar uma edição, baixar o conteúdo e escolher o idioma estrangeiro quando aplicável (Figura 2a). O feed apresenta o enunciado, as alternativas e o cronômetro. A resposta ou o término do tempo bloqueia as alternativas e apresenta feedback (Figura 2c). Nas alterações de setembro, foram incorporadas a pausa do timer ao sair da questão visível e a possibilidade de riscar alternativas durante a leitura, preservando o rascunho local (Figura 2b).</w:t>
+      </w:r>
+    </w:p>
+    <w:p>
+      <w:pPr>
+        <w:keepNext/>
+        <w:spacing w:before="0" w:after="120" w:line="240" w:lineRule="auto"/>
+      </w:pPr>
+      <w:r>
+        <w:rPr>
+          <w:rFonts w:ascii="Times New Roman" w:hAnsi="Times New Roman"/>
+        </w:rPr>
+        <w:t xml:space="preserve">Figura 2 - Fluxo de estudo: (a) catálogo de provas; (b) questão com cronômetro e alternativas riscadas; (c) feedback após resposta incorreta</w:t>
+      </w:r>
+    </w:p>
+    <w:p>
+      <w:pPr>
+        <w:keepNext/>
+        <w:jc w:val="center"/>
+      </w:pPr>
+      <w:r>
+        <w:rPr>
+          <w:rFonts w:ascii="Times New Roman" w:hAnsi="Times New Roman"/>
+        </w:rPr>
+        <w:drawing>
+          <wp:inline xmlns:a="http://schemas.openxmlformats.org/drawingml/2006/main" xmlns:pic="http://schemas.openxmlformats.org/drawingml/2006/picture">
+            <wp:extent cx="5580000" cy="3885140"/>
+            <wp:docPr id="2" name="Picture 2"/>
+            <wp:cNvGraphicFramePr>
+              <a:graphicFrameLocks noChangeAspect="1"/>
+            </wp:cNvGraphicFramePr>
+            <a:graphic>
+              <a:graphicData uri="http://schemas.openxmlformats.org/drawingml/2006/picture">
+                <pic:pic>
+                  <pic:nvPicPr>
+                    <pic:cNvPr id="0" name="fluxo-estudo.png"/>
+                    <pic:cNvPicPr/>
+                  </pic:nvPicPr>
+                  <pic:blipFill>
+                    <a:blip r:embed="rId14"/>
+                    <a:stretch>
+                      <a:fillRect/>
+                    </a:stretch>
+                  </pic:blipFill>
+                  <pic:spPr>
+                    <a:xfrm>
+                      <a:off x="0" y="0"/>
+                      <a:ext cx="5580000" cy="3885140"/>
+                    </a:xfrm>
+                    <a:prstGeom prst="rect"/>
+                  </pic:spPr>
+                </pic:pic>
+              </a:graphicData>
+            </a:graphic>
+          </wp:inline>
+        </w:drawing>
+      </w:r>
+    </w:p>
+    <w:p>
+      <w:pPr>
+        <w:spacing w:before="0" w:after="240" w:line="240" w:lineRule="auto"/>
+      </w:pPr>
+      <w:r>
+        <w:rPr>
+          <w:rFonts w:ascii="Times New Roman" w:hAnsi="Times New Roman"/>
+          <w:sz w:val="20"/>
+        </w:rPr>
+        <w:t xml:space="preserve">Fonte: Capturas de tela da aplicação na revisão 0179585, obtidas pelo grupo com Playwright (2026).</w:t>
+      </w:r>
+    </w:p>
+    <w:p>
+      <w:pPr>
+        <w:spacing w:before="0" w:after="240" w:line="360" w:lineRule="auto"/>
+      </w:pPr>
+      <w:r>
+        <w:rPr>
+          <w:rFonts w:ascii="Times New Roman" w:hAnsi="Times New Roman"/>
+        </w:rPr>
+        <w:t xml:space="preserve">As estatísticas incluem questões vistas e respondidas, taxa de acerto, esgotamentos de tempo, tempo médio e sequência de dias estudados, com agrupamentos por matéria e prova (Figura 3c). Esses recursos já permitem apresentar informações da prática. A Figura 3 também mostra uma edição baixada e ativa no dispositivo e o bloqueio de uma questão ao fim dos três minutos. Os números do painel correspondem a uma sessão de demonstração do grupo, com quatro questões, e não a dados de estudantes.</w:t>
+      </w:r>
+    </w:p>
+    <w:p>
+      <w:pPr>
+        <w:keepNext/>
+        <w:spacing w:before="0" w:after="120" w:line="240" w:lineRule="auto"/>
+      </w:pPr>
+      <w:r>
+        <w:rPr>
+          <w:rFonts w:ascii="Times New Roman" w:hAnsi="Times New Roman"/>
+        </w:rPr>
+        <w:t xml:space="preserve">Figura 3 - Uso offline, tempo e desempenho: (a) edição baixada e ativa; (b) questão bloqueada por tempo esgotado; (c) painel de estatísticas</w:t>
+      </w:r>
+    </w:p>
+    <w:p>
+      <w:pPr>
+        <w:keepNext/>
+        <w:jc w:val="center"/>
+      </w:pPr>
+      <w:r>
+        <w:rPr>
+          <w:rFonts w:ascii="Times New Roman" w:hAnsi="Times New Roman"/>
+        </w:rPr>
+        <w:drawing>
+          <wp:inline xmlns:a="http://schemas.openxmlformats.org/drawingml/2006/main" xmlns:pic="http://schemas.openxmlformats.org/drawingml/2006/picture">
+            <wp:extent cx="5580000" cy="3885140"/>
+            <wp:docPr id="3" name="Picture 3"/>
+            <wp:cNvGraphicFramePr>
+              <a:graphicFrameLocks noChangeAspect="1"/>
+            </wp:cNvGraphicFramePr>
+            <a:graphic>
+              <a:graphicData uri="http://schemas.openxmlformats.org/drawingml/2006/picture">
+                <pic:pic>
+                  <pic:nvPicPr>
+                    <pic:cNvPr id="0" name="offline-tempo-estatisticas.png"/>
+                    <pic:cNvPicPr/>
+                  </pic:nvPicPr>
+                  <pic:blipFill>
+                    <a:blip r:embed="rId15"/>
+                    <a:stretch>
+                      <a:fillRect/>
+                    </a:stretch>
+                  </pic:blipFill>
+                  <pic:spPr>
+                    <a:xfrm>
+                      <a:off x="0" y="0"/>
+                      <a:ext cx="5580000" cy="3885140"/>
+                    </a:xfrm>
+                    <a:prstGeom prst="rect"/>
+                  </pic:spPr>
+                </pic:pic>
+              </a:graphicData>
+            </a:graphic>
+          </wp:inline>
+        </w:drawing>
+      </w:r>
+    </w:p>
+    <w:p>
+      <w:pPr>
+        <w:spacing w:before="0" w:after="240" w:line="240" w:lineRule="auto"/>
+      </w:pPr>
+      <w:r>
+        <w:rPr>
+          <w:rFonts w:ascii="Times New Roman" w:hAnsi="Times New Roman"/>
+          <w:sz w:val="20"/>
+        </w:rPr>
+        <w:t xml:space="preserve">Fonte: Capturas de tela da aplicação na revisão 0179585, obtidas pelo grupo com Playwright (2026).</w:t>
+      </w:r>
+    </w:p>
+    <w:p>
+      <w:pPr>
+        <w:spacing w:before="0" w:after="240" w:line="360" w:lineRule="auto"/>
+      </w:pPr>
+      <w:r>
+        <w:rPr>
+          <w:rFonts w:ascii="Times New Roman" w:hAnsi="Times New Roman"/>
+        </w:rPr>
+        <w:t xml:space="preserve">A Tabela 2 distingue essa implementação de entregas que ainda exigem validação ou desenvolvimento.</w:t>
       </w:r>
     </w:p>
     <w:p>
@@ -2245,7 +2410,7 @@
         <w:rPr>
           <w:rFonts w:ascii="Times New Roman" w:hAnsi="Times New Roman"/>
         </w:rPr>
-        <w:t>Há evidências documentais de verificação técnica na versão inicial: o registro de revisão de qualidade de 23 de agosto informa aprovação de 52 testes em 15 arquivos e de quatro testes em Chromium. Esses números pertencem àquela revisão e não representam uma execução atual da suíte ampliada. A documentação de testes também explicita o uso de serviços simulados e a necessidade de verificação real da infraestrutura externa (SOUZA; SILVA; BASTOS NETO, 2026b).</w:t>
+        <w:t xml:space="preserve">A verificação técnica foi repetida na revisão consultada (0179585), em 30 de setembro de 2026. Os 203 testes de unidade e integração, distribuídos em 26 arquivos, foram aprovados; na primeira revisão de qualidade, em 23 de agosto, a suíte tinha 52 testes em 15 arquivos. Na suíte de navegador, cinco dos seis cenários foram aprovados. O cenário restante falhou por uma verificação que não foi atualizada após a ampliação do catálogo: ela procura um número de questões que agora aparece em mais de uma edição. A documentação de testes também explicita o uso de serviços simulados e a necessidade de verificação real da infraestrutura externa (SOUZA; SILVA; BASTOS NETO, 2026b).</w:t>
       </w:r>
     </w:p>
     <w:p>
@@ -2280,7 +2445,20 @@
         <w:rPr>
           <w:rFonts w:ascii="Times New Roman" w:hAnsi="Times New Roman"/>
         </w:rPr>
-        <w:t>BETTER AUTH. Introduction. [S.l.], [s.d.]. Disponível em: https://better-auth.com/docs/introduction. Acesso em: 30 set. 2026.</w:t>
+        <w:t xml:space="preserve">ALMEIDA, Thales Sales; LAITZ, Thiago; BONÁS, Giovana K.; NOGUEIRA, Rodrigo. BLUEX: a benchmark based on Brazilian Leading Universities Entrance eXams. </w:t>
+      </w:r>
+      <w:r>
+        <w:rPr>
+          <w:rFonts w:ascii="Times New Roman" w:hAnsi="Times New Roman"/>
+          <w:b/>
+        </w:rPr>
+        <w:t xml:space="preserve">arXiv</w:t>
+      </w:r>
+      <w:r>
+        <w:rPr>
+          <w:rFonts w:ascii="Times New Roman" w:hAnsi="Times New Roman"/>
+        </w:rPr>
+        <w:t xml:space="preserve">, 2023. arXiv:2307.05410. Disponível em: https://arxiv.org/abs/2307.05410. Acesso em: 30 set. 2026.</w:t>
       </w:r>
     </w:p>
     <w:p>
@@ -2292,7 +2470,20 @@
         <w:rPr>
           <w:rFonts w:ascii="Times New Roman" w:hAnsi="Times New Roman"/>
         </w:rPr>
-        <w:t>CLOUDFLARE. Cloudflare D1. [S.l.], 2026. Disponível em: https://developers.cloudflare.com/d1/. Acesso em: 30 set. 2026.</w:t>
+        <w:t xml:space="preserve">BETTER AUTH. </w:t>
+      </w:r>
+      <w:r>
+        <w:rPr>
+          <w:rFonts w:ascii="Times New Roman" w:hAnsi="Times New Roman"/>
+          <w:b/>
+        </w:rPr>
+        <w:t xml:space="preserve">Introduction</w:t>
+      </w:r>
+      <w:r>
+        <w:rPr>
+          <w:rFonts w:ascii="Times New Roman" w:hAnsi="Times New Roman"/>
+        </w:rPr>
+        <w:t xml:space="preserve">. [S.l.], [s.d.]. Disponível em: https://better-auth.com/docs/introduction. Acesso em: 30 set. 2026.</w:t>
       </w:r>
     </w:p>
     <w:p>
@@ -2304,7 +2495,20 @@
         <w:rPr>
           <w:rFonts w:ascii="Times New Roman" w:hAnsi="Times New Roman"/>
         </w:rPr>
-        <w:t>MDN WEB DOCS. Offline and background operation. [S.l.], [s.d.]. Disponível em: https://developer.mozilla.org/en-US/docs/Web/Progressive_web_apps/Guides/Offline_and_background_operation. Acesso em: 30 set. 2026.</w:t>
+        <w:t xml:space="preserve">CLOUDFLARE. </w:t>
+      </w:r>
+      <w:r>
+        <w:rPr>
+          <w:rFonts w:ascii="Times New Roman" w:hAnsi="Times New Roman"/>
+          <w:b/>
+        </w:rPr>
+        <w:t xml:space="preserve">Cloudflare D1</w:t>
+      </w:r>
+      <w:r>
+        <w:rPr>
+          <w:rFonts w:ascii="Times New Roman" w:hAnsi="Times New Roman"/>
+        </w:rPr>
+        <w:t xml:space="preserve">. [S.l.], 2026. Disponível em: https://developers.cloudflare.com/d1/. Acesso em: 30 set. 2026.</w:t>
       </w:r>
     </w:p>
     <w:p>
@@ -2316,7 +2520,20 @@
         <w:rPr>
           <w:rFonts w:ascii="Times New Roman" w:hAnsi="Times New Roman"/>
         </w:rPr>
-        <w:t>SAILER, Michael; HOMNER, Lisa. The gamification of learning: a meta-analysis. Educational Psychology Review, v. 32, p. 77-112, 2020. DOI: 10.1007/s10648-019-09498-w. Disponível em: https://link.springer.com/article/10.1007/s10648-019-09498-w. Acesso em: 30 set. 2026.</w:t>
+        <w:t xml:space="preserve">DUNLOSKY, John; RAWSON, Katherine A.; MARSH, Elizabeth J.; NATHAN, Mitchell J.; WILLINGHAM, Daniel T. Improving students’ learning with effective learning techniques: promising directions from cognitive and educational psychology. </w:t>
+      </w:r>
+      <w:r>
+        <w:rPr>
+          <w:rFonts w:ascii="Times New Roman" w:hAnsi="Times New Roman"/>
+          <w:b/>
+        </w:rPr>
+        <w:t xml:space="preserve">Psychological Science in the Public Interest</w:t>
+      </w:r>
+      <w:r>
+        <w:rPr>
+          <w:rFonts w:ascii="Times New Roman" w:hAnsi="Times New Roman"/>
+        </w:rPr>
+        <w:t xml:space="preserve">, v. 14, n. 1, p. 4-58, 2013. DOI: 10.1177/1529100612453266.</w:t>
       </w:r>
     </w:p>
     <w:p>
@@ -2328,7 +2545,20 @@
         <w:rPr>
           <w:rFonts w:ascii="Times New Roman" w:hAnsi="Times New Roman"/>
         </w:rPr>
-        <w:t>SOUZA, Paulo Vitor de; SILVA, Erikson Souza da; BASTOS NETO, Elias Alves. Plano de ação: Projeto Integrador 2 - PJI240. Campinas, 2026a. Documento de planejamento do grupo.</w:t>
+        <w:t xml:space="preserve">ENEM.DEV. </w:t>
+      </w:r>
+      <w:r>
+        <w:rPr>
+          <w:rFonts w:ascii="Times New Roman" w:hAnsi="Times New Roman"/>
+          <w:b/>
+        </w:rPr>
+        <w:t xml:space="preserve">API enem.dev</w:t>
+      </w:r>
+      <w:r>
+        <w:rPr>
+          <w:rFonts w:ascii="Times New Roman" w:hAnsi="Times New Roman"/>
+        </w:rPr>
+        <w:t xml:space="preserve">. [S.l.], [s.d.]. Disponível em: https://enem.dev. Acesso em: 30 set. 2026.</w:t>
       </w:r>
     </w:p>
     <w:p>
@@ -2340,7 +2570,20 @@
         <w:rPr>
           <w:rFonts w:ascii="Times New Roman" w:hAnsi="Times New Roman"/>
         </w:rPr>
-        <w:t>SOUZA, Paulo Vitor de; SILVA, Erikson Souza da; BASTOS NETO, Elias Alves. Maratona: plataforma offline de questões. Repositório de código e documentação. 2026b. Revisão consultada: 0179585c780a1ba7ffc4c6884ef5e9d3b86aabd1, de 29 set. 2026. Disponível em: https://github.com/paulop2/projeto-integrador-PJI240. Acesso em: 30 set. 2026.</w:t>
+        <w:t xml:space="preserve">INEP – INSTITUTO NACIONAL DE ESTUDOS E PESQUISAS EDUCACIONAIS ANÍSIO TEIXEIRA. Edital nº 30, de 5 de maio de 2023. </w:t>
+      </w:r>
+      <w:r>
+        <w:rPr>
+          <w:rFonts w:ascii="Times New Roman" w:hAnsi="Times New Roman"/>
+          <w:b/>
+        </w:rPr>
+        <w:t xml:space="preserve">Exame Nacional do Ensino Médio (Enem) 2023</w:t>
+      </w:r>
+      <w:r>
+        <w:rPr>
+          <w:rFonts w:ascii="Times New Roman" w:hAnsi="Times New Roman"/>
+        </w:rPr>
+        <w:t xml:space="preserve">. Brasília, DF: Inep, 2023. Disponível em: https://download.inep.gov.br/enem/edital_2023_leitor_de_tela.txt. Acesso em: 30 set. 2026.</w:t>
       </w:r>
     </w:p>
     <w:p>
@@ -2352,7 +2595,170 @@
         <w:rPr>
           <w:rFonts w:ascii="Times New Roman" w:hAnsi="Times New Roman"/>
         </w:rPr>
-        <w:t>W3C. Web Content Accessibility Guidelines (WCAG) 2.2. W3C Recommendation, 12 dez. 2024. Disponível em: https://www.w3.org/TR/WCAG22/. Acesso em: 30 set. 2026.</w:t>
+        <w:t xml:space="preserve">MDN WEB DOCS. </w:t>
+      </w:r>
+      <w:r>
+        <w:rPr>
+          <w:rFonts w:ascii="Times New Roman" w:hAnsi="Times New Roman"/>
+          <w:b/>
+        </w:rPr>
+        <w:t xml:space="preserve">Offline and background operation</w:t>
+      </w:r>
+      <w:r>
+        <w:rPr>
+          <w:rFonts w:ascii="Times New Roman" w:hAnsi="Times New Roman"/>
+        </w:rPr>
+        <w:t xml:space="preserve">. [S.l.], [s.d.]. Disponível em: https://developer.mozilla.org/en-US/docs/Web/Progressive_web_apps/Guides/Offline_and_background_operation. Acesso em: 30 set. 2026.</w:t>
+      </w:r>
+    </w:p>
+    <w:p>
+      <w:pPr>
+        <w:spacing w:before="0" w:after="240" w:line="240" w:lineRule="auto"/>
+        <w:jc w:val="left"/>
+      </w:pPr>
+      <w:r>
+        <w:rPr>
+          <w:rFonts w:ascii="Times New Roman" w:hAnsi="Times New Roman"/>
+        </w:rPr>
+        <w:t xml:space="preserve">PORTUGUESE BENCHMARK DATASETS. </w:t>
+      </w:r>
+      <w:r>
+        <w:rPr>
+          <w:rFonts w:ascii="Times New Roman" w:hAnsi="Times New Roman"/>
+          <w:b/>
+        </w:rPr>
+        <w:t xml:space="preserve">BLUEX</w:t>
+      </w:r>
+      <w:r>
+        <w:rPr>
+          <w:rFonts w:ascii="Times New Roman" w:hAnsi="Times New Roman"/>
+        </w:rPr>
+        <w:t xml:space="preserve">. Hugging Face, [s.d.]. Disponível em: https://huggingface.co/datasets/portuguese-benchmark-datasets/BLUEX. Acesso em: 30 set. 2026.</w:t>
+      </w:r>
+    </w:p>
+    <w:p>
+      <w:pPr>
+        <w:spacing w:before="0" w:after="240" w:line="240" w:lineRule="auto"/>
+        <w:jc w:val="left"/>
+      </w:pPr>
+      <w:r>
+        <w:rPr>
+          <w:rFonts w:ascii="Times New Roman" w:hAnsi="Times New Roman"/>
+        </w:rPr>
+        <w:t xml:space="preserve">ROEDIGER, Henry L.; KARPICKE, Jeffrey D. Test-enhanced learning: taking memory tests improves long-term retention. </w:t>
+      </w:r>
+      <w:r>
+        <w:rPr>
+          <w:rFonts w:ascii="Times New Roman" w:hAnsi="Times New Roman"/>
+          <w:b/>
+        </w:rPr>
+        <w:t xml:space="preserve">Psychological Science</w:t>
+      </w:r>
+      <w:r>
+        <w:rPr>
+          <w:rFonts w:ascii="Times New Roman" w:hAnsi="Times New Roman"/>
+        </w:rPr>
+        <w:t xml:space="preserve">, v. 17, n. 3, p. 249-255, 2006. DOI: 10.1111/j.1467-9280.2006.01693.x.</w:t>
+      </w:r>
+    </w:p>
+    <w:p>
+      <w:pPr>
+        <w:spacing w:before="0" w:after="240" w:line="240" w:lineRule="auto"/>
+        <w:jc w:val="left"/>
+      </w:pPr>
+      <w:r>
+        <w:rPr>
+          <w:rFonts w:ascii="Times New Roman" w:hAnsi="Times New Roman"/>
+        </w:rPr>
+        <w:t xml:space="preserve">SAILER, Michael; HOMNER, Lisa. The gamification of learning: a meta-analysis. </w:t>
+      </w:r>
+      <w:r>
+        <w:rPr>
+          <w:rFonts w:ascii="Times New Roman" w:hAnsi="Times New Roman"/>
+          <w:b/>
+        </w:rPr>
+        <w:t xml:space="preserve">Educational Psychology Review</w:t>
+      </w:r>
+      <w:r>
+        <w:rPr>
+          <w:rFonts w:ascii="Times New Roman" w:hAnsi="Times New Roman"/>
+        </w:rPr>
+        <w:t xml:space="preserve">, v. 32, p. 77-112, 2020. DOI: 10.1007/s10648-019-09498-w. Disponível em: https://link.springer.com/article/10.1007/s10648-019-09498-w. Acesso em: 30 set. 2026.</w:t>
+      </w:r>
+    </w:p>
+    <w:p>
+      <w:pPr>
+        <w:spacing w:before="0" w:after="240" w:line="240" w:lineRule="auto"/>
+        <w:jc w:val="left"/>
+      </w:pPr>
+      <w:r>
+        <w:rPr>
+          <w:rFonts w:ascii="Times New Roman" w:hAnsi="Times New Roman"/>
+        </w:rPr>
+        <w:t xml:space="preserve">SOUZA, Paulo Vitor de; SILVA, Erikson Souza da; BASTOS NETO, Elias Alves. </w:t>
+      </w:r>
+      <w:r>
+        <w:rPr>
+          <w:rFonts w:ascii="Times New Roman" w:hAnsi="Times New Roman"/>
+          <w:b/>
+        </w:rPr>
+        <w:t xml:space="preserve">Plano de ação</w:t>
+      </w:r>
+      <w:r>
+        <w:rPr>
+          <w:rFonts w:ascii="Times New Roman" w:hAnsi="Times New Roman"/>
+        </w:rPr>
+        <w:t xml:space="preserve">: Projeto Integrador 2 - PJI240. Campinas, 2026a. Documento de planejamento do grupo.</w:t>
+      </w:r>
+    </w:p>
+    <w:p>
+      <w:pPr>
+        <w:spacing w:before="0" w:after="240" w:line="240" w:lineRule="auto"/>
+        <w:jc w:val="left"/>
+      </w:pPr>
+      <w:r>
+        <w:rPr>
+          <w:rFonts w:ascii="Times New Roman" w:hAnsi="Times New Roman"/>
+        </w:rPr>
+        <w:t xml:space="preserve">SOUZA, Paulo Vitor de; SILVA, Erikson Souza da; BASTOS NETO, Elias Alves. </w:t>
+      </w:r>
+      <w:r>
+        <w:rPr>
+          <w:rFonts w:ascii="Times New Roman" w:hAnsi="Times New Roman"/>
+          <w:b/>
+        </w:rPr>
+        <w:t xml:space="preserve">Maratona</w:t>
+      </w:r>
+      <w:r>
+        <w:rPr>
+          <w:rFonts w:ascii="Times New Roman" w:hAnsi="Times New Roman"/>
+        </w:rPr>
+        <w:t xml:space="preserve">: plataforma offline de questões. Repositório de código e documentação. 2026b. Revisão consultada: 0179585c780a1ba7ffc4c6884ef5e9d3b86aabd1, de 29 set. 2026. Disponível em: https://github.com/paulop2/projeto-integrador-PJI240. Acesso em: 30 set. 2026.</w:t>
+      </w:r>
+    </w:p>
+    <w:p>
+      <w:pPr>
+        <w:spacing w:before="0" w:after="240" w:line="240" w:lineRule="auto"/>
+        <w:jc w:val="left"/>
+      </w:pPr>
+      <w:r>
+        <w:rPr>
+          <w:rFonts w:ascii="Times New Roman" w:hAnsi="Times New Roman"/>
+        </w:rPr>
+        <w:t xml:space="preserve">W3C. </w:t>
+      </w:r>
+      <w:r>
+        <w:rPr>
+          <w:rFonts w:ascii="Times New Roman" w:hAnsi="Times New Roman"/>
+          <w:b/>
+        </w:rPr>
+        <w:t xml:space="preserve">Web Content Accessibility Guidelines (WCAG) 2.2</w:t>
+      </w:r>
+      <w:r>
+        <w:rPr>
+          <w:rFonts w:ascii="Times New Roman" w:hAnsi="Times New Roman"/>
+        </w:rPr>
+        <w:t xml:space="preserve">. W3C Recommendation, 12 dez. 2024. Disponível em: https://www.w3.org/TR/WCAG22/. Acesso em: 30 set. 2026.</w:t>
       </w:r>
     </w:p>
     <w:sectPr>

</xml_diff>